<commit_message>
Ajuste de requisito funcional 6
</commit_message>
<xml_diff>
--- a/Documentacion/PROYECTO_JOSUE_DIEGO_JESUS.docx
+++ b/Documentacion/PROYECTO_JOSUE_DIEGO_JESUS.docx
@@ -1212,7 +1212,7 @@
     <w:sdt>
       <w:sdtPr>
         <w:lock w:val="contentLocked"/>
-        <w:id w:val="-490032374"/>
+        <w:id w:val="1219731518"/>
         <w:tag w:val="goog_rdk_0"/>
       </w:sdtPr>
       <w:sdtContent>
@@ -2076,7 +2076,7 @@
     <w:sdt>
       <w:sdtPr>
         <w:lock w:val="contentLocked"/>
-        <w:id w:val="-1857567570"/>
+        <w:id w:val="-58493044"/>
         <w:tag w:val="goog_rdk_1"/>
       </w:sdtPr>
       <w:sdtContent>
@@ -2662,7 +2662,7 @@
     <w:sdt>
       <w:sdtPr>
         <w:lock w:val="contentLocked"/>
-        <w:id w:val="-36373586"/>
+        <w:id w:val="-56902415"/>
         <w:tag w:val="goog_rdk_2"/>
       </w:sdtPr>
       <w:sdtContent>
@@ -3313,7 +3313,7 @@
     <w:sdt>
       <w:sdtPr>
         <w:lock w:val="contentLocked"/>
-        <w:id w:val="641754627"/>
+        <w:id w:val="1451599361"/>
         <w:tag w:val="goog_rdk_3"/>
       </w:sdtPr>
       <w:sdtContent>
@@ -3899,7 +3899,7 @@
     <w:sdt>
       <w:sdtPr>
         <w:lock w:val="contentLocked"/>
-        <w:id w:val="-2058927436"/>
+        <w:id w:val="-730812075"/>
         <w:tag w:val="goog_rdk_4"/>
       </w:sdtPr>
       <w:sdtContent>
@@ -4550,7 +4550,7 @@
     <w:sdt>
       <w:sdtPr>
         <w:lock w:val="contentLocked"/>
-        <w:id w:val="1658965686"/>
+        <w:id w:val="813973298"/>
         <w:tag w:val="goog_rdk_5"/>
       </w:sdtPr>
       <w:sdtContent>
@@ -4705,7 +4705,7 @@
                   <w:rPr>
                     <w:rtl w:val="0"/>
                   </w:rPr>
-                  <w:t xml:space="preserve">Confirmación o cancelación de la cita</w:t>
+                  <w:t xml:space="preserve">Confirmación, cancelación y reprogramación de citas</w:t>
                 </w:r>
               </w:p>
             </w:tc>
@@ -4770,7 +4770,7 @@
                   <w:rPr>
                     <w:rtl w:val="0"/>
                   </w:rPr>
-                  <w:t xml:space="preserve">Permitir que el paciente confirme o libere el espacio con una sola acción, facilitando la reasignación del cupo</w:t>
+                  <w:t xml:space="preserve">Permitir que el paciente confirme, libere el espacio o reprograme la cita con una sola acción, facilitando la reasignación del cupo</w:t>
                 </w:r>
               </w:p>
             </w:tc>
@@ -4835,7 +4835,7 @@
                   <w:rPr>
                     <w:rtl w:val="0"/>
                   </w:rPr>
-                  <w:t xml:space="preserve">El sistema debe permitir confirmar o cancelar la cita desde el recordatorio recibido, actualizando la agenda automáticamente</w:t>
+                  <w:t xml:space="preserve">El sistema debe permitir confirmar, cancelar o reprogramar  la cita desde el recordatorio recibido, actualizando la agenda automáticamente</w:t>
                 </w:r>
               </w:p>
             </w:tc>
@@ -4900,7 +4900,7 @@
                   <w:rPr>
                     <w:rtl w:val="0"/>
                   </w:rPr>
-                  <w:t xml:space="preserve">Respuesta del paciente (confirmar/cancelar)</w:t>
+                  <w:t xml:space="preserve">Respuesta del paciente (confirmar/cancelar/reprogramar)</w:t>
                 </w:r>
               </w:p>
             </w:tc>
@@ -5201,7 +5201,7 @@
     <w:sdt>
       <w:sdtPr>
         <w:lock w:val="contentLocked"/>
-        <w:id w:val="-1854778032"/>
+        <w:id w:val="527247302"/>
         <w:tag w:val="goog_rdk_6"/>
       </w:sdtPr>
       <w:sdtContent>
@@ -5852,7 +5852,7 @@
     <w:sdt>
       <w:sdtPr>
         <w:lock w:val="contentLocked"/>
-        <w:id w:val="1257337703"/>
+        <w:id w:val="-2137651712"/>
         <w:tag w:val="goog_rdk_7"/>
       </w:sdtPr>
       <w:sdtContent>
@@ -6503,7 +6503,7 @@
     <w:sdt>
       <w:sdtPr>
         <w:lock w:val="contentLocked"/>
-        <w:id w:val="2122457943"/>
+        <w:id w:val="-1981732552"/>
         <w:tag w:val="goog_rdk_8"/>
       </w:sdtPr>
       <w:sdtContent>
@@ -7089,7 +7089,7 @@
     <w:sdt>
       <w:sdtPr>
         <w:lock w:val="contentLocked"/>
-        <w:id w:val="-490454150"/>
+        <w:id w:val="-1198003136"/>
         <w:tag w:val="goog_rdk_9"/>
       </w:sdtPr>
       <w:sdtContent>
@@ -7244,7 +7244,7 @@
                   <w:rPr>
                     <w:rtl w:val="0"/>
                   </w:rPr>
-                  <w:t xml:space="preserve">Cancelación y reprogramación de citas</w:t>
+                  <w:t xml:space="preserve">Generación de reportes administrativos</w:t>
                 </w:r>
               </w:p>
             </w:tc>
@@ -7309,7 +7309,7 @@
                   <w:rPr>
                     <w:rtl w:val="0"/>
                   </w:rPr>
-                  <w:t xml:space="preserve">Formalizar como regla de negocio la liberación y reasignación de espacios en la agenda, evitando que cupos cancelados queden sin uso</w:t>
+                  <w:t xml:space="preserve">Brindar al personal administrativo visibilidad consolidada de la operación para apoyar la toma de decisiones</w:t>
                 </w:r>
               </w:p>
             </w:tc>
@@ -7374,7 +7374,7 @@
                   <w:rPr>
                     <w:rtl w:val="0"/>
                   </w:rPr>
-                  <w:t xml:space="preserve">El sistema debe permitir al paciente cancelar o reprogramar su cita desde la plataforma web con un límite máximo de hasta 12 horas de antelación a la cita. Si el tiempo es menor a 12 horas, la gestión quedará bloqueada en el sistema y el paciente deberá comunicarse directamente con la auxiliar.</w:t>
+                  <w:t xml:space="preserve">El sistema debe generar reportes mensuales y diarios exportables que cuantifiquen: total de pacientes atendidos (entre 8 y 15 según la jornada), cantidad de citas canceladas, e índice de inasistencia, filtrables por especialista y rango de fechas.</w:t>
                 </w:r>
               </w:p>
             </w:tc>
@@ -7439,7 +7439,7 @@
                   <w:rPr>
                     <w:rtl w:val="0"/>
                   </w:rPr>
-                  <w:t xml:space="preserve">Cita existente, nueva fecha /hora (en caso de reprogramación) o solicitud de cancelación</w:t>
+                  <w:t xml:space="preserve">Rango de fechas, odontólogo (opcional), tipo de reporte</w:t>
                 </w:r>
               </w:p>
             </w:tc>
@@ -7504,7 +7504,7 @@
                   <w:rPr>
                     <w:rtl w:val="0"/>
                   </w:rPr>
-                  <w:t xml:space="preserve">Agenda actualizada con el cupo liberado o reasignado</w:t>
+                  <w:t xml:space="preserve">Reporte consolidado en pantalla o exportable</w:t>
                 </w:r>
               </w:p>
             </w:tc>
@@ -7699,7 +7699,7 @@
                   <w:rPr>
                     <w:rtl w:val="0"/>
                   </w:rPr>
-                  <w:t xml:space="preserve">Dado que faltan 10 horas para una cita programada, cuando el paciente intenta cancelarla desde la plataforma web, entonces el botón de cancelación debe estar deshabilitado indicando que debe llamar a la clínica.</w:t>
+                  <w:t xml:space="preserve">Dado que un usuario con rol administrativo selecciona el mes actual, cuando presiona "Generar", entonces el sistema debe descargar un documento con el total de citas, cancelaciones e inasistencias en menos de 5 segundos.</w:t>
                 </w:r>
               </w:p>
             </w:tc>
@@ -7724,7 +7724,25 @@
     </w:p>
     <w:p>
       <w:pPr>
-        <w:ind w:firstLine="0"/>
+        <w:ind w:firstLine="708.6614173228347"/>
+        <w:jc w:val="left"/>
+        <w:rPr>
+          <w:b w:val="1"/>
+          <w:bCs w:val="1"/>
+        </w:rPr>
+      </w:pPr>
+      <w:r>
+        <w:rPr>
+          <w:b w:val="1"/>
+          <w:bCs w:val="1"/>
+          <w:rtl w:val="0"/>
+        </w:rPr>
+        <w:t xml:space="preserve">Requisitos No Funcionales</w:t>
+      </w:r>
+    </w:p>
+    <w:p>
+      <w:pPr>
+        <w:ind w:firstLine="708.6614173228347"/>
         <w:jc w:val="left"/>
         <w:rPr>
           <w:b w:val="1"/>
@@ -7740,7 +7758,7 @@
     <w:sdt>
       <w:sdtPr>
         <w:lock w:val="contentLocked"/>
-        <w:id w:val="240647151"/>
+        <w:id w:val="240153319"/>
         <w:tag w:val="goog_rdk_10"/>
       </w:sdtPr>
       <w:sdtContent>
@@ -7788,9 +7806,20 @@
               </w:tcPr>
               <w:p>
                 <w:pPr>
-                  <w:widowControl w:val="0"/>
-                  <w:spacing w:after="0" w:line="240" w:lineRule="auto"/>
-                  <w:ind w:firstLine="0"/>
+                  <w:keepNext w:val="0"/>
+                  <w:keepLines w:val="0"/>
+                  <w:pageBreakBefore w:val="0"/>
+                  <w:widowControl w:val="0"/>
+                  <w:pBdr>
+                    <w:top w:space="0" w:sz="0" w:val="nil"/>
+                    <w:left w:space="0" w:sz="0" w:val="nil"/>
+                    <w:bottom w:space="0" w:sz="0" w:val="nil"/>
+                    <w:right w:space="0" w:sz="0" w:val="nil"/>
+                    <w:between w:space="0" w:sz="0" w:val="nil"/>
+                  </w:pBdr>
+                  <w:shd w:fill="auto" w:val="clear"/>
+                  <w:spacing w:after="0" w:before="0" w:line="240" w:lineRule="auto"/>
+                  <w:ind w:left="0" w:right="0" w:firstLine="0"/>
                   <w:jc w:val="left"/>
                   <w:rPr>
                     <w:b w:val="1"/>
@@ -7820,42 +7849,64 @@
               </w:tcPr>
               <w:p>
                 <w:pPr>
-                  <w:widowControl w:val="0"/>
-                  <w:spacing w:after="0" w:line="240" w:lineRule="auto"/>
-                  <w:ind w:firstLine="0"/>
-                  <w:jc w:val="left"/>
-                  <w:rPr/>
-                </w:pPr>
-                <w:r>
-                  <w:rPr>
-                    <w:rtl w:val="0"/>
-                  </w:rPr>
-                  <w:t xml:space="preserve">RF11</w:t>
-                </w:r>
-              </w:p>
-            </w:tc>
-          </w:tr>
-          <w:tr>
-            <w:trPr>
-              <w:cantSplit w:val="0"/>
-              <w:tblHeader w:val="0"/>
-            </w:trPr>
-            <w:tc>
-              <w:tcPr>
-                <w:shd w:fill="auto" w:val="clear"/>
-                <w:tcMar>
-                  <w:top w:w="100.0" w:type="dxa"/>
-                  <w:left w:w="100.0" w:type="dxa"/>
-                  <w:bottom w:w="100.0" w:type="dxa"/>
-                  <w:right w:w="100.0" w:type="dxa"/>
-                </w:tcMar>
-                <w:vAlign w:val="top"/>
-              </w:tcPr>
-              <w:p>
-                <w:pPr>
-                  <w:widowControl w:val="0"/>
-                  <w:spacing w:after="0" w:line="240" w:lineRule="auto"/>
-                  <w:ind w:firstLine="0"/>
+                  <w:keepNext w:val="0"/>
+                  <w:keepLines w:val="0"/>
+                  <w:pageBreakBefore w:val="0"/>
+                  <w:widowControl w:val="0"/>
+                  <w:pBdr>
+                    <w:top w:space="0" w:sz="0" w:val="nil"/>
+                    <w:left w:space="0" w:sz="0" w:val="nil"/>
+                    <w:bottom w:space="0" w:sz="0" w:val="nil"/>
+                    <w:right w:space="0" w:sz="0" w:val="nil"/>
+                    <w:between w:space="0" w:sz="0" w:val="nil"/>
+                  </w:pBdr>
+                  <w:shd w:fill="auto" w:val="clear"/>
+                  <w:spacing w:after="0" w:before="0" w:line="240" w:lineRule="auto"/>
+                  <w:ind w:left="0" w:right="0" w:firstLine="0"/>
+                  <w:jc w:val="left"/>
+                  <w:rPr/>
+                </w:pPr>
+                <w:r>
+                  <w:rPr>
+                    <w:rtl w:val="0"/>
+                  </w:rPr>
+                  <w:t xml:space="preserve">RNF01</w:t>
+                </w:r>
+              </w:p>
+            </w:tc>
+          </w:tr>
+          <w:tr>
+            <w:trPr>
+              <w:cantSplit w:val="0"/>
+              <w:tblHeader w:val="0"/>
+            </w:trPr>
+            <w:tc>
+              <w:tcPr>
+                <w:shd w:fill="auto" w:val="clear"/>
+                <w:tcMar>
+                  <w:top w:w="100.0" w:type="dxa"/>
+                  <w:left w:w="100.0" w:type="dxa"/>
+                  <w:bottom w:w="100.0" w:type="dxa"/>
+                  <w:right w:w="100.0" w:type="dxa"/>
+                </w:tcMar>
+                <w:vAlign w:val="top"/>
+              </w:tcPr>
+              <w:p>
+                <w:pPr>
+                  <w:keepNext w:val="0"/>
+                  <w:keepLines w:val="0"/>
+                  <w:pageBreakBefore w:val="0"/>
+                  <w:widowControl w:val="0"/>
+                  <w:pBdr>
+                    <w:top w:space="0" w:sz="0" w:val="nil"/>
+                    <w:left w:space="0" w:sz="0" w:val="nil"/>
+                    <w:bottom w:space="0" w:sz="0" w:val="nil"/>
+                    <w:right w:space="0" w:sz="0" w:val="nil"/>
+                    <w:between w:space="0" w:sz="0" w:val="nil"/>
+                  </w:pBdr>
+                  <w:shd w:fill="auto" w:val="clear"/>
+                  <w:spacing w:after="0" w:before="0" w:line="240" w:lineRule="auto"/>
+                  <w:ind w:left="0" w:right="0" w:firstLine="0"/>
                   <w:jc w:val="left"/>
                   <w:rPr>
                     <w:b w:val="1"/>
@@ -7885,107 +7936,64 @@
               </w:tcPr>
               <w:p>
                 <w:pPr>
-                  <w:widowControl w:val="0"/>
-                  <w:spacing w:after="0" w:line="240" w:lineRule="auto"/>
-                  <w:ind w:firstLine="0"/>
-                  <w:jc w:val="left"/>
-                  <w:rPr/>
-                </w:pPr>
-                <w:r>
-                  <w:rPr>
-                    <w:rtl w:val="0"/>
-                  </w:rPr>
-                  <w:t xml:space="preserve">Generación de reportes administrativos</w:t>
-                </w:r>
-              </w:p>
-            </w:tc>
-          </w:tr>
-          <w:tr>
-            <w:trPr>
-              <w:cantSplit w:val="0"/>
-              <w:tblHeader w:val="0"/>
-            </w:trPr>
-            <w:tc>
-              <w:tcPr>
-                <w:shd w:fill="auto" w:val="clear"/>
-                <w:tcMar>
-                  <w:top w:w="100.0" w:type="dxa"/>
-                  <w:left w:w="100.0" w:type="dxa"/>
-                  <w:bottom w:w="100.0" w:type="dxa"/>
-                  <w:right w:w="100.0" w:type="dxa"/>
-                </w:tcMar>
-                <w:vAlign w:val="top"/>
-              </w:tcPr>
-              <w:p>
-                <w:pPr>
-                  <w:widowControl w:val="0"/>
-                  <w:spacing w:after="0" w:line="240" w:lineRule="auto"/>
-                  <w:ind w:firstLine="0"/>
-                  <w:jc w:val="left"/>
-                  <w:rPr>
-                    <w:b w:val="1"/>
-                    <w:bCs w:val="1"/>
-                  </w:rPr>
-                </w:pPr>
-                <w:r>
-                  <w:rPr>
-                    <w:b w:val="1"/>
-                    <w:bCs w:val="1"/>
-                    <w:rtl w:val="0"/>
-                  </w:rPr>
-                  <w:t xml:space="preserve">Propósito</w:t>
-                </w:r>
-              </w:p>
-            </w:tc>
-            <w:tc>
-              <w:tcPr>
-                <w:shd w:fill="auto" w:val="clear"/>
-                <w:tcMar>
-                  <w:top w:w="100.0" w:type="dxa"/>
-                  <w:left w:w="100.0" w:type="dxa"/>
-                  <w:bottom w:w="100.0" w:type="dxa"/>
-                  <w:right w:w="100.0" w:type="dxa"/>
-                </w:tcMar>
-                <w:vAlign w:val="top"/>
-              </w:tcPr>
-              <w:p>
-                <w:pPr>
-                  <w:widowControl w:val="0"/>
-                  <w:spacing w:after="0" w:line="240" w:lineRule="auto"/>
-                  <w:ind w:firstLine="0"/>
-                  <w:jc w:val="left"/>
-                  <w:rPr/>
-                </w:pPr>
-                <w:r>
-                  <w:rPr>
-                    <w:rtl w:val="0"/>
-                  </w:rPr>
-                  <w:t xml:space="preserve">Brindar al personal administrativo visibilidad consolidada de la operación para apoyar la toma de decisiones</w:t>
-                </w:r>
-              </w:p>
-            </w:tc>
-          </w:tr>
-          <w:tr>
-            <w:trPr>
-              <w:cantSplit w:val="0"/>
-              <w:tblHeader w:val="0"/>
-            </w:trPr>
-            <w:tc>
-              <w:tcPr>
-                <w:shd w:fill="auto" w:val="clear"/>
-                <w:tcMar>
-                  <w:top w:w="100.0" w:type="dxa"/>
-                  <w:left w:w="100.0" w:type="dxa"/>
-                  <w:bottom w:w="100.0" w:type="dxa"/>
-                  <w:right w:w="100.0" w:type="dxa"/>
-                </w:tcMar>
-                <w:vAlign w:val="top"/>
-              </w:tcPr>
-              <w:p>
-                <w:pPr>
-                  <w:widowControl w:val="0"/>
-                  <w:spacing w:after="0" w:line="240" w:lineRule="auto"/>
-                  <w:ind w:firstLine="0"/>
+                  <w:keepNext w:val="0"/>
+                  <w:keepLines w:val="0"/>
+                  <w:pageBreakBefore w:val="0"/>
+                  <w:widowControl w:val="0"/>
+                  <w:pBdr>
+                    <w:top w:space="0" w:sz="0" w:val="nil"/>
+                    <w:left w:space="0" w:sz="0" w:val="nil"/>
+                    <w:bottom w:space="0" w:sz="0" w:val="nil"/>
+                    <w:right w:space="0" w:sz="0" w:val="nil"/>
+                    <w:between w:space="0" w:sz="0" w:val="nil"/>
+                  </w:pBdr>
+                  <w:shd w:fill="auto" w:val="clear"/>
+                  <w:spacing w:after="0" w:before="0" w:line="240" w:lineRule="auto"/>
+                  <w:ind w:left="0" w:right="0" w:firstLine="0"/>
+                  <w:jc w:val="left"/>
+                  <w:rPr/>
+                </w:pPr>
+                <w:r>
+                  <w:rPr>
+                    <w:rtl w:val="0"/>
+                  </w:rPr>
+                  <w:t xml:space="preserve">Compatibilidad con infraestructura existente</w:t>
+                </w:r>
+              </w:p>
+            </w:tc>
+          </w:tr>
+          <w:tr>
+            <w:trPr>
+              <w:cantSplit w:val="0"/>
+              <w:tblHeader w:val="0"/>
+            </w:trPr>
+            <w:tc>
+              <w:tcPr>
+                <w:shd w:fill="auto" w:val="clear"/>
+                <w:tcMar>
+                  <w:top w:w="100.0" w:type="dxa"/>
+                  <w:left w:w="100.0" w:type="dxa"/>
+                  <w:bottom w:w="100.0" w:type="dxa"/>
+                  <w:right w:w="100.0" w:type="dxa"/>
+                </w:tcMar>
+                <w:vAlign w:val="top"/>
+              </w:tcPr>
+              <w:p>
+                <w:pPr>
+                  <w:keepNext w:val="0"/>
+                  <w:keepLines w:val="0"/>
+                  <w:pageBreakBefore w:val="0"/>
+                  <w:widowControl w:val="0"/>
+                  <w:pBdr>
+                    <w:top w:space="0" w:sz="0" w:val="nil"/>
+                    <w:left w:space="0" w:sz="0" w:val="nil"/>
+                    <w:bottom w:space="0" w:sz="0" w:val="nil"/>
+                    <w:right w:space="0" w:sz="0" w:val="nil"/>
+                    <w:between w:space="0" w:sz="0" w:val="nil"/>
+                  </w:pBdr>
+                  <w:shd w:fill="auto" w:val="clear"/>
+                  <w:spacing w:after="0" w:before="0" w:line="240" w:lineRule="auto"/>
+                  <w:ind w:left="0" w:right="0" w:firstLine="0"/>
                   <w:jc w:val="left"/>
                   <w:rPr>
                     <w:b w:val="1"/>
@@ -8015,172 +8023,64 @@
               </w:tcPr>
               <w:p>
                 <w:pPr>
-                  <w:widowControl w:val="0"/>
-                  <w:spacing w:after="0" w:line="240" w:lineRule="auto"/>
-                  <w:ind w:firstLine="0"/>
-                  <w:jc w:val="left"/>
-                  <w:rPr/>
-                </w:pPr>
-                <w:r>
-                  <w:rPr>
-                    <w:rtl w:val="0"/>
-                  </w:rPr>
-                  <w:t xml:space="preserve">El sistema debe generar reportes mensuales y diarios exportables que cuantifiquen: total de pacientes atendidos (entre 8 y 15 según la jornada), cantidad de citas canceladas, e índice de inasistencia, filtrables por especialista y rango de fechas.</w:t>
-                </w:r>
-              </w:p>
-            </w:tc>
-          </w:tr>
-          <w:tr>
-            <w:trPr>
-              <w:cantSplit w:val="0"/>
-              <w:tblHeader w:val="0"/>
-            </w:trPr>
-            <w:tc>
-              <w:tcPr>
-                <w:shd w:fill="auto" w:val="clear"/>
-                <w:tcMar>
-                  <w:top w:w="100.0" w:type="dxa"/>
-                  <w:left w:w="100.0" w:type="dxa"/>
-                  <w:bottom w:w="100.0" w:type="dxa"/>
-                  <w:right w:w="100.0" w:type="dxa"/>
-                </w:tcMar>
-                <w:vAlign w:val="top"/>
-              </w:tcPr>
-              <w:p>
-                <w:pPr>
-                  <w:widowControl w:val="0"/>
-                  <w:spacing w:after="0" w:line="240" w:lineRule="auto"/>
-                  <w:ind w:firstLine="0"/>
-                  <w:jc w:val="left"/>
-                  <w:rPr>
-                    <w:b w:val="1"/>
-                    <w:bCs w:val="1"/>
-                  </w:rPr>
-                </w:pPr>
-                <w:r>
-                  <w:rPr>
-                    <w:b w:val="1"/>
-                    <w:bCs w:val="1"/>
-                    <w:rtl w:val="0"/>
-                  </w:rPr>
-                  <w:t xml:space="preserve">Entrada</w:t>
-                </w:r>
-              </w:p>
-            </w:tc>
-            <w:tc>
-              <w:tcPr>
-                <w:shd w:fill="auto" w:val="clear"/>
-                <w:tcMar>
-                  <w:top w:w="100.0" w:type="dxa"/>
-                  <w:left w:w="100.0" w:type="dxa"/>
-                  <w:bottom w:w="100.0" w:type="dxa"/>
-                  <w:right w:w="100.0" w:type="dxa"/>
-                </w:tcMar>
-                <w:vAlign w:val="top"/>
-              </w:tcPr>
-              <w:p>
-                <w:pPr>
-                  <w:widowControl w:val="0"/>
-                  <w:spacing w:after="0" w:line="240" w:lineRule="auto"/>
-                  <w:ind w:firstLine="0"/>
-                  <w:jc w:val="left"/>
-                  <w:rPr/>
-                </w:pPr>
-                <w:r>
-                  <w:rPr>
-                    <w:rtl w:val="0"/>
-                  </w:rPr>
-                  <w:t xml:space="preserve">Rango de fechas, odontólogo (opcional), tipo de reporte</w:t>
-                </w:r>
-              </w:p>
-            </w:tc>
-          </w:tr>
-          <w:tr>
-            <w:trPr>
-              <w:cantSplit w:val="0"/>
-              <w:tblHeader w:val="0"/>
-            </w:trPr>
-            <w:tc>
-              <w:tcPr>
-                <w:shd w:fill="auto" w:val="clear"/>
-                <w:tcMar>
-                  <w:top w:w="100.0" w:type="dxa"/>
-                  <w:left w:w="100.0" w:type="dxa"/>
-                  <w:bottom w:w="100.0" w:type="dxa"/>
-                  <w:right w:w="100.0" w:type="dxa"/>
-                </w:tcMar>
-                <w:vAlign w:val="top"/>
-              </w:tcPr>
-              <w:p>
-                <w:pPr>
-                  <w:widowControl w:val="0"/>
-                  <w:spacing w:after="0" w:line="240" w:lineRule="auto"/>
-                  <w:ind w:firstLine="0"/>
-                  <w:jc w:val="left"/>
-                  <w:rPr>
-                    <w:b w:val="1"/>
-                    <w:bCs w:val="1"/>
-                  </w:rPr>
-                </w:pPr>
-                <w:r>
-                  <w:rPr>
-                    <w:b w:val="1"/>
-                    <w:bCs w:val="1"/>
-                    <w:rtl w:val="0"/>
-                  </w:rPr>
-                  <w:t xml:space="preserve">Salida</w:t>
-                </w:r>
-              </w:p>
-            </w:tc>
-            <w:tc>
-              <w:tcPr>
-                <w:shd w:fill="auto" w:val="clear"/>
-                <w:tcMar>
-                  <w:top w:w="100.0" w:type="dxa"/>
-                  <w:left w:w="100.0" w:type="dxa"/>
-                  <w:bottom w:w="100.0" w:type="dxa"/>
-                  <w:right w:w="100.0" w:type="dxa"/>
-                </w:tcMar>
-                <w:vAlign w:val="top"/>
-              </w:tcPr>
-              <w:p>
-                <w:pPr>
-                  <w:widowControl w:val="0"/>
-                  <w:spacing w:after="0" w:line="240" w:lineRule="auto"/>
-                  <w:ind w:firstLine="0"/>
-                  <w:jc w:val="left"/>
-                  <w:rPr/>
-                </w:pPr>
-                <w:r>
-                  <w:rPr>
-                    <w:rtl w:val="0"/>
-                  </w:rPr>
-                  <w:t xml:space="preserve">Reporte consolidado en pantalla o exportable</w:t>
-                </w:r>
-              </w:p>
-            </w:tc>
-          </w:tr>
-          <w:tr>
-            <w:trPr>
-              <w:cantSplit w:val="0"/>
-              <w:tblHeader w:val="0"/>
-            </w:trPr>
-            <w:tc>
-              <w:tcPr>
-                <w:shd w:fill="auto" w:val="clear"/>
-                <w:tcMar>
-                  <w:top w:w="100.0" w:type="dxa"/>
-                  <w:left w:w="100.0" w:type="dxa"/>
-                  <w:bottom w:w="100.0" w:type="dxa"/>
-                  <w:right w:w="100.0" w:type="dxa"/>
-                </w:tcMar>
-                <w:vAlign w:val="top"/>
-              </w:tcPr>
-              <w:p>
-                <w:pPr>
-                  <w:widowControl w:val="0"/>
-                  <w:spacing w:after="0" w:line="240" w:lineRule="auto"/>
-                  <w:ind w:firstLine="0"/>
+                  <w:keepNext w:val="0"/>
+                  <w:keepLines w:val="0"/>
+                  <w:pageBreakBefore w:val="0"/>
+                  <w:widowControl w:val="0"/>
+                  <w:pBdr>
+                    <w:top w:space="0" w:sz="0" w:val="nil"/>
+                    <w:left w:space="0" w:sz="0" w:val="nil"/>
+                    <w:bottom w:space="0" w:sz="0" w:val="nil"/>
+                    <w:right w:space="0" w:sz="0" w:val="nil"/>
+                    <w:between w:space="0" w:sz="0" w:val="nil"/>
+                  </w:pBdr>
+                  <w:shd w:fill="auto" w:val="clear"/>
+                  <w:spacing w:after="0" w:before="0" w:line="240" w:lineRule="auto"/>
+                  <w:ind w:left="0" w:right="0" w:firstLine="0"/>
+                  <w:jc w:val="left"/>
+                  <w:rPr/>
+                </w:pPr>
+                <w:r>
+                  <w:rPr>
+                    <w:rtl w:val="0"/>
+                  </w:rPr>
+                  <w:t xml:space="preserve">El sistema debe operar sobre la infraestructura ya disponible ( computador con conexión a internet), sin requerir hardware adicional</w:t>
+                </w:r>
+              </w:p>
+            </w:tc>
+          </w:tr>
+          <w:tr>
+            <w:trPr>
+              <w:cantSplit w:val="0"/>
+              <w:tblHeader w:val="0"/>
+            </w:trPr>
+            <w:tc>
+              <w:tcPr>
+                <w:shd w:fill="auto" w:val="clear"/>
+                <w:tcMar>
+                  <w:top w:w="100.0" w:type="dxa"/>
+                  <w:left w:w="100.0" w:type="dxa"/>
+                  <w:bottom w:w="100.0" w:type="dxa"/>
+                  <w:right w:w="100.0" w:type="dxa"/>
+                </w:tcMar>
+                <w:vAlign w:val="top"/>
+              </w:tcPr>
+              <w:p>
+                <w:pPr>
+                  <w:keepNext w:val="0"/>
+                  <w:keepLines w:val="0"/>
+                  <w:pageBreakBefore w:val="0"/>
+                  <w:widowControl w:val="0"/>
+                  <w:pBdr>
+                    <w:top w:space="0" w:sz="0" w:val="nil"/>
+                    <w:left w:space="0" w:sz="0" w:val="nil"/>
+                    <w:bottom w:space="0" w:sz="0" w:val="nil"/>
+                    <w:right w:space="0" w:sz="0" w:val="nil"/>
+                    <w:between w:space="0" w:sz="0" w:val="nil"/>
+                  </w:pBdr>
+                  <w:shd w:fill="auto" w:val="clear"/>
+                  <w:spacing w:after="0" w:before="0" w:line="240" w:lineRule="auto"/>
+                  <w:ind w:left="0" w:right="0" w:firstLine="0"/>
                   <w:jc w:val="left"/>
                   <w:rPr>
                     <w:b w:val="1"/>
@@ -8210,9 +8110,20 @@
               </w:tcPr>
               <w:p>
                 <w:pPr>
-                  <w:widowControl w:val="0"/>
-                  <w:spacing w:after="0" w:line="240" w:lineRule="auto"/>
-                  <w:ind w:firstLine="0"/>
+                  <w:keepNext w:val="0"/>
+                  <w:keepLines w:val="0"/>
+                  <w:pageBreakBefore w:val="0"/>
+                  <w:widowControl w:val="0"/>
+                  <w:pBdr>
+                    <w:top w:space="0" w:sz="0" w:val="nil"/>
+                    <w:left w:space="0" w:sz="0" w:val="nil"/>
+                    <w:bottom w:space="0" w:sz="0" w:val="nil"/>
+                    <w:right w:space="0" w:sz="0" w:val="nil"/>
+                    <w:between w:space="0" w:sz="0" w:val="nil"/>
+                  </w:pBdr>
+                  <w:shd w:fill="auto" w:val="clear"/>
+                  <w:spacing w:after="0" w:before="0" w:line="240" w:lineRule="auto"/>
+                  <w:ind w:left="0" w:right="0" w:firstLine="0"/>
                   <w:jc w:val="left"/>
                   <w:rPr/>
                 </w:pPr>
@@ -8221,136 +8132,6 @@
                     <w:rtl w:val="0"/>
                   </w:rPr>
                   <w:t xml:space="preserve">Media</w:t>
-                </w:r>
-              </w:p>
-            </w:tc>
-          </w:tr>
-          <w:tr>
-            <w:trPr>
-              <w:cantSplit w:val="0"/>
-              <w:tblHeader w:val="0"/>
-            </w:trPr>
-            <w:tc>
-              <w:tcPr>
-                <w:shd w:fill="auto" w:val="clear"/>
-                <w:tcMar>
-                  <w:top w:w="100.0" w:type="dxa"/>
-                  <w:left w:w="100.0" w:type="dxa"/>
-                  <w:bottom w:w="100.0" w:type="dxa"/>
-                  <w:right w:w="100.0" w:type="dxa"/>
-                </w:tcMar>
-                <w:vAlign w:val="top"/>
-              </w:tcPr>
-              <w:p>
-                <w:pPr>
-                  <w:widowControl w:val="0"/>
-                  <w:spacing w:after="0" w:line="240" w:lineRule="auto"/>
-                  <w:ind w:firstLine="0"/>
-                  <w:jc w:val="left"/>
-                  <w:rPr>
-                    <w:b w:val="1"/>
-                    <w:bCs w:val="1"/>
-                  </w:rPr>
-                </w:pPr>
-                <w:r>
-                  <w:rPr>
-                    <w:b w:val="1"/>
-                    <w:bCs w:val="1"/>
-                    <w:rtl w:val="0"/>
-                  </w:rPr>
-                  <w:t xml:space="preserve">Dependencias</w:t>
-                </w:r>
-              </w:p>
-            </w:tc>
-            <w:tc>
-              <w:tcPr>
-                <w:shd w:fill="auto" w:val="clear"/>
-                <w:tcMar>
-                  <w:top w:w="100.0" w:type="dxa"/>
-                  <w:left w:w="100.0" w:type="dxa"/>
-                  <w:bottom w:w="100.0" w:type="dxa"/>
-                  <w:right w:w="100.0" w:type="dxa"/>
-                </w:tcMar>
-                <w:vAlign w:val="top"/>
-              </w:tcPr>
-              <w:p>
-                <w:pPr>
-                  <w:widowControl w:val="0"/>
-                  <w:spacing w:after="0" w:line="240" w:lineRule="auto"/>
-                  <w:ind w:firstLine="0"/>
-                  <w:jc w:val="left"/>
-                  <w:rPr/>
-                </w:pPr>
-                <w:r>
-                  <w:rPr>
-                    <w:rtl w:val="0"/>
-                  </w:rPr>
-                  <w:t xml:space="preserve">RF09</w:t>
-                </w:r>
-              </w:p>
-            </w:tc>
-          </w:tr>
-          <w:tr>
-            <w:trPr>
-              <w:cantSplit w:val="0"/>
-              <w:tblHeader w:val="0"/>
-            </w:trPr>
-            <w:tc>
-              <w:tcPr>
-                <w:shd w:fill="auto" w:val="clear"/>
-                <w:tcMar>
-                  <w:top w:w="100.0" w:type="dxa"/>
-                  <w:left w:w="100.0" w:type="dxa"/>
-                  <w:bottom w:w="100.0" w:type="dxa"/>
-                  <w:right w:w="100.0" w:type="dxa"/>
-                </w:tcMar>
-                <w:vAlign w:val="top"/>
-              </w:tcPr>
-              <w:p>
-                <w:pPr>
-                  <w:widowControl w:val="0"/>
-                  <w:spacing w:after="0" w:line="240" w:lineRule="auto"/>
-                  <w:ind w:firstLine="0"/>
-                  <w:jc w:val="left"/>
-                  <w:rPr>
-                    <w:b w:val="1"/>
-                    <w:bCs w:val="1"/>
-                  </w:rPr>
-                </w:pPr>
-                <w:r>
-                  <w:rPr>
-                    <w:b w:val="1"/>
-                    <w:bCs w:val="1"/>
-                    <w:rtl w:val="0"/>
-                  </w:rPr>
-                  <w:t xml:space="preserve">Criterio de Aceptación</w:t>
-                </w:r>
-              </w:p>
-            </w:tc>
-            <w:tc>
-              <w:tcPr>
-                <w:shd w:fill="auto" w:val="clear"/>
-                <w:tcMar>
-                  <w:top w:w="100.0" w:type="dxa"/>
-                  <w:left w:w="100.0" w:type="dxa"/>
-                  <w:bottom w:w="100.0" w:type="dxa"/>
-                  <w:right w:w="100.0" w:type="dxa"/>
-                </w:tcMar>
-                <w:vAlign w:val="top"/>
-              </w:tcPr>
-              <w:p>
-                <w:pPr>
-                  <w:widowControl w:val="0"/>
-                  <w:spacing w:after="0" w:line="240" w:lineRule="auto"/>
-                  <w:ind w:firstLine="0"/>
-                  <w:jc w:val="left"/>
-                  <w:rPr/>
-                </w:pPr>
-                <w:r>
-                  <w:rPr>
-                    <w:rtl w:val="0"/>
-                  </w:rPr>
-                  <w:t xml:space="preserve">Dado que un usuario con rol administrativo selecciona el mes actual, cuando presiona "Generar", entonces el sistema debe descargar un documento con el total de citas, cancelaciones e inasistencias en menos de 5 segundos.</w:t>
                 </w:r>
               </w:p>
             </w:tc>
@@ -8360,7 +8141,7 @@
     </w:sdt>
     <w:p>
       <w:pPr>
-        <w:ind w:firstLine="0"/>
+        <w:ind w:firstLine="708.6614173228347"/>
         <w:jc w:val="left"/>
         <w:rPr>
           <w:b w:val="1"/>
@@ -8371,24 +8152,6 @@
         <w:rPr>
           <w:rtl w:val="0"/>
         </w:rPr>
-      </w:r>
-    </w:p>
-    <w:p>
-      <w:pPr>
-        <w:ind w:firstLine="708.6614173228347"/>
-        <w:jc w:val="left"/>
-        <w:rPr>
-          <w:b w:val="1"/>
-          <w:bCs w:val="1"/>
-        </w:rPr>
-      </w:pPr>
-      <w:r>
-        <w:rPr>
-          <w:b w:val="1"/>
-          <w:bCs w:val="1"/>
-          <w:rtl w:val="0"/>
-        </w:rPr>
-        <w:t xml:space="preserve">Requisitos No Funcionales</w:t>
       </w:r>
     </w:p>
     <w:p>
@@ -8409,7 +8172,7 @@
     <w:sdt>
       <w:sdtPr>
         <w:lock w:val="contentLocked"/>
-        <w:id w:val="95049971"/>
+        <w:id w:val="143355093"/>
         <w:tag w:val="goog_rdk_11"/>
       </w:sdtPr>
       <w:sdtContent>
@@ -8457,20 +8220,9 @@
               </w:tcPr>
               <w:p>
                 <w:pPr>
-                  <w:keepNext w:val="0"/>
-                  <w:keepLines w:val="0"/>
-                  <w:pageBreakBefore w:val="0"/>
-                  <w:widowControl w:val="0"/>
-                  <w:pBdr>
-                    <w:top w:space="0" w:sz="0" w:val="nil"/>
-                    <w:left w:space="0" w:sz="0" w:val="nil"/>
-                    <w:bottom w:space="0" w:sz="0" w:val="nil"/>
-                    <w:right w:space="0" w:sz="0" w:val="nil"/>
-                    <w:between w:space="0" w:sz="0" w:val="nil"/>
-                  </w:pBdr>
-                  <w:shd w:fill="auto" w:val="clear"/>
-                  <w:spacing w:after="0" w:before="0" w:line="240" w:lineRule="auto"/>
-                  <w:ind w:left="0" w:right="0" w:firstLine="0"/>
+                  <w:widowControl w:val="0"/>
+                  <w:spacing w:after="0" w:line="240" w:lineRule="auto"/>
+                  <w:ind w:firstLine="0"/>
                   <w:jc w:val="left"/>
                   <w:rPr>
                     <w:b w:val="1"/>
@@ -8500,64 +8252,42 @@
               </w:tcPr>
               <w:p>
                 <w:pPr>
-                  <w:keepNext w:val="0"/>
-                  <w:keepLines w:val="0"/>
-                  <w:pageBreakBefore w:val="0"/>
-                  <w:widowControl w:val="0"/>
-                  <w:pBdr>
-                    <w:top w:space="0" w:sz="0" w:val="nil"/>
-                    <w:left w:space="0" w:sz="0" w:val="nil"/>
-                    <w:bottom w:space="0" w:sz="0" w:val="nil"/>
-                    <w:right w:space="0" w:sz="0" w:val="nil"/>
-                    <w:between w:space="0" w:sz="0" w:val="nil"/>
-                  </w:pBdr>
-                  <w:shd w:fill="auto" w:val="clear"/>
-                  <w:spacing w:after="0" w:before="0" w:line="240" w:lineRule="auto"/>
-                  <w:ind w:left="0" w:right="0" w:firstLine="0"/>
-                  <w:jc w:val="left"/>
-                  <w:rPr/>
-                </w:pPr>
-                <w:r>
-                  <w:rPr>
-                    <w:rtl w:val="0"/>
-                  </w:rPr>
-                  <w:t xml:space="preserve">RNF01</w:t>
-                </w:r>
-              </w:p>
-            </w:tc>
-          </w:tr>
-          <w:tr>
-            <w:trPr>
-              <w:cantSplit w:val="0"/>
-              <w:tblHeader w:val="0"/>
-            </w:trPr>
-            <w:tc>
-              <w:tcPr>
-                <w:shd w:fill="auto" w:val="clear"/>
-                <w:tcMar>
-                  <w:top w:w="100.0" w:type="dxa"/>
-                  <w:left w:w="100.0" w:type="dxa"/>
-                  <w:bottom w:w="100.0" w:type="dxa"/>
-                  <w:right w:w="100.0" w:type="dxa"/>
-                </w:tcMar>
-                <w:vAlign w:val="top"/>
-              </w:tcPr>
-              <w:p>
-                <w:pPr>
-                  <w:keepNext w:val="0"/>
-                  <w:keepLines w:val="0"/>
-                  <w:pageBreakBefore w:val="0"/>
-                  <w:widowControl w:val="0"/>
-                  <w:pBdr>
-                    <w:top w:space="0" w:sz="0" w:val="nil"/>
-                    <w:left w:space="0" w:sz="0" w:val="nil"/>
-                    <w:bottom w:space="0" w:sz="0" w:val="nil"/>
-                    <w:right w:space="0" w:sz="0" w:val="nil"/>
-                    <w:between w:space="0" w:sz="0" w:val="nil"/>
-                  </w:pBdr>
-                  <w:shd w:fill="auto" w:val="clear"/>
-                  <w:spacing w:after="0" w:before="0" w:line="240" w:lineRule="auto"/>
-                  <w:ind w:left="0" w:right="0" w:firstLine="0"/>
+                  <w:widowControl w:val="0"/>
+                  <w:spacing w:after="0" w:line="240" w:lineRule="auto"/>
+                  <w:ind w:firstLine="0"/>
+                  <w:jc w:val="left"/>
+                  <w:rPr/>
+                </w:pPr>
+                <w:r>
+                  <w:rPr>
+                    <w:rtl w:val="0"/>
+                  </w:rPr>
+                  <w:t xml:space="preserve">RNF02</w:t>
+                </w:r>
+              </w:p>
+            </w:tc>
+          </w:tr>
+          <w:tr>
+            <w:trPr>
+              <w:cantSplit w:val="0"/>
+              <w:tblHeader w:val="0"/>
+            </w:trPr>
+            <w:tc>
+              <w:tcPr>
+                <w:shd w:fill="auto" w:val="clear"/>
+                <w:tcMar>
+                  <w:top w:w="100.0" w:type="dxa"/>
+                  <w:left w:w="100.0" w:type="dxa"/>
+                  <w:bottom w:w="100.0" w:type="dxa"/>
+                  <w:right w:w="100.0" w:type="dxa"/>
+                </w:tcMar>
+                <w:vAlign w:val="top"/>
+              </w:tcPr>
+              <w:p>
+                <w:pPr>
+                  <w:widowControl w:val="0"/>
+                  <w:spacing w:after="0" w:line="240" w:lineRule="auto"/>
+                  <w:ind w:firstLine="0"/>
                   <w:jc w:val="left"/>
                   <w:rPr>
                     <w:b w:val="1"/>
@@ -8587,64 +8317,42 @@
               </w:tcPr>
               <w:p>
                 <w:pPr>
-                  <w:keepNext w:val="0"/>
-                  <w:keepLines w:val="0"/>
-                  <w:pageBreakBefore w:val="0"/>
-                  <w:widowControl w:val="0"/>
-                  <w:pBdr>
-                    <w:top w:space="0" w:sz="0" w:val="nil"/>
-                    <w:left w:space="0" w:sz="0" w:val="nil"/>
-                    <w:bottom w:space="0" w:sz="0" w:val="nil"/>
-                    <w:right w:space="0" w:sz="0" w:val="nil"/>
-                    <w:between w:space="0" w:sz="0" w:val="nil"/>
-                  </w:pBdr>
-                  <w:shd w:fill="auto" w:val="clear"/>
-                  <w:spacing w:after="0" w:before="0" w:line="240" w:lineRule="auto"/>
-                  <w:ind w:left="0" w:right="0" w:firstLine="0"/>
-                  <w:jc w:val="left"/>
-                  <w:rPr/>
-                </w:pPr>
-                <w:r>
-                  <w:rPr>
-                    <w:rtl w:val="0"/>
-                  </w:rPr>
-                  <w:t xml:space="preserve">Compatibilidad con infraestructura existente</w:t>
-                </w:r>
-              </w:p>
-            </w:tc>
-          </w:tr>
-          <w:tr>
-            <w:trPr>
-              <w:cantSplit w:val="0"/>
-              <w:tblHeader w:val="0"/>
-            </w:trPr>
-            <w:tc>
-              <w:tcPr>
-                <w:shd w:fill="auto" w:val="clear"/>
-                <w:tcMar>
-                  <w:top w:w="100.0" w:type="dxa"/>
-                  <w:left w:w="100.0" w:type="dxa"/>
-                  <w:bottom w:w="100.0" w:type="dxa"/>
-                  <w:right w:w="100.0" w:type="dxa"/>
-                </w:tcMar>
-                <w:vAlign w:val="top"/>
-              </w:tcPr>
-              <w:p>
-                <w:pPr>
-                  <w:keepNext w:val="0"/>
-                  <w:keepLines w:val="0"/>
-                  <w:pageBreakBefore w:val="0"/>
-                  <w:widowControl w:val="0"/>
-                  <w:pBdr>
-                    <w:top w:space="0" w:sz="0" w:val="nil"/>
-                    <w:left w:space="0" w:sz="0" w:val="nil"/>
-                    <w:bottom w:space="0" w:sz="0" w:val="nil"/>
-                    <w:right w:space="0" w:sz="0" w:val="nil"/>
-                    <w:between w:space="0" w:sz="0" w:val="nil"/>
-                  </w:pBdr>
-                  <w:shd w:fill="auto" w:val="clear"/>
-                  <w:spacing w:after="0" w:before="0" w:line="240" w:lineRule="auto"/>
-                  <w:ind w:left="0" w:right="0" w:firstLine="0"/>
+                  <w:widowControl w:val="0"/>
+                  <w:spacing w:after="0" w:line="240" w:lineRule="auto"/>
+                  <w:ind w:firstLine="0"/>
+                  <w:jc w:val="left"/>
+                  <w:rPr/>
+                </w:pPr>
+                <w:r>
+                  <w:rPr>
+                    <w:rtl w:val="0"/>
+                  </w:rPr>
+                  <w:t xml:space="preserve">Interfaz simple y accesible</w:t>
+                </w:r>
+              </w:p>
+            </w:tc>
+          </w:tr>
+          <w:tr>
+            <w:trPr>
+              <w:cantSplit w:val="0"/>
+              <w:tblHeader w:val="0"/>
+            </w:trPr>
+            <w:tc>
+              <w:tcPr>
+                <w:shd w:fill="auto" w:val="clear"/>
+                <w:tcMar>
+                  <w:top w:w="100.0" w:type="dxa"/>
+                  <w:left w:w="100.0" w:type="dxa"/>
+                  <w:bottom w:w="100.0" w:type="dxa"/>
+                  <w:right w:w="100.0" w:type="dxa"/>
+                </w:tcMar>
+                <w:vAlign w:val="top"/>
+              </w:tcPr>
+              <w:p>
+                <w:pPr>
+                  <w:widowControl w:val="0"/>
+                  <w:spacing w:after="0" w:line="240" w:lineRule="auto"/>
+                  <w:ind w:firstLine="0"/>
                   <w:jc w:val="left"/>
                   <w:rPr>
                     <w:b w:val="1"/>
@@ -8674,64 +8382,42 @@
               </w:tcPr>
               <w:p>
                 <w:pPr>
-                  <w:keepNext w:val="0"/>
-                  <w:keepLines w:val="0"/>
-                  <w:pageBreakBefore w:val="0"/>
-                  <w:widowControl w:val="0"/>
-                  <w:pBdr>
-                    <w:top w:space="0" w:sz="0" w:val="nil"/>
-                    <w:left w:space="0" w:sz="0" w:val="nil"/>
-                    <w:bottom w:space="0" w:sz="0" w:val="nil"/>
-                    <w:right w:space="0" w:sz="0" w:val="nil"/>
-                    <w:between w:space="0" w:sz="0" w:val="nil"/>
-                  </w:pBdr>
-                  <w:shd w:fill="auto" w:val="clear"/>
-                  <w:spacing w:after="0" w:before="0" w:line="240" w:lineRule="auto"/>
-                  <w:ind w:left="0" w:right="0" w:firstLine="0"/>
-                  <w:jc w:val="left"/>
-                  <w:rPr/>
-                </w:pPr>
-                <w:r>
-                  <w:rPr>
-                    <w:rtl w:val="0"/>
-                  </w:rPr>
-                  <w:t xml:space="preserve">El sistema debe operar sobre la infraestructura ya disponible ( computador con conexión a internet), sin requerir hardware adicional</w:t>
-                </w:r>
-              </w:p>
-            </w:tc>
-          </w:tr>
-          <w:tr>
-            <w:trPr>
-              <w:cantSplit w:val="0"/>
-              <w:tblHeader w:val="0"/>
-            </w:trPr>
-            <w:tc>
-              <w:tcPr>
-                <w:shd w:fill="auto" w:val="clear"/>
-                <w:tcMar>
-                  <w:top w:w="100.0" w:type="dxa"/>
-                  <w:left w:w="100.0" w:type="dxa"/>
-                  <w:bottom w:w="100.0" w:type="dxa"/>
-                  <w:right w:w="100.0" w:type="dxa"/>
-                </w:tcMar>
-                <w:vAlign w:val="top"/>
-              </w:tcPr>
-              <w:p>
-                <w:pPr>
-                  <w:keepNext w:val="0"/>
-                  <w:keepLines w:val="0"/>
-                  <w:pageBreakBefore w:val="0"/>
-                  <w:widowControl w:val="0"/>
-                  <w:pBdr>
-                    <w:top w:space="0" w:sz="0" w:val="nil"/>
-                    <w:left w:space="0" w:sz="0" w:val="nil"/>
-                    <w:bottom w:space="0" w:sz="0" w:val="nil"/>
-                    <w:right w:space="0" w:sz="0" w:val="nil"/>
-                    <w:between w:space="0" w:sz="0" w:val="nil"/>
-                  </w:pBdr>
-                  <w:shd w:fill="auto" w:val="clear"/>
-                  <w:spacing w:after="0" w:before="0" w:line="240" w:lineRule="auto"/>
-                  <w:ind w:left="0" w:right="0" w:firstLine="0"/>
+                  <w:widowControl w:val="0"/>
+                  <w:spacing w:after="0" w:line="240" w:lineRule="auto"/>
+                  <w:ind w:firstLine="0"/>
+                  <w:jc w:val="left"/>
+                  <w:rPr/>
+                </w:pPr>
+                <w:r>
+                  <w:rPr>
+                    <w:rtl w:val="0"/>
+                  </w:rPr>
+                  <w:t xml:space="preserve">La interfaz dirigida a los pacientes debe permitir completar el proceso de agendamiento en un máximo de 3 pasos (selección de horario, ingreso de nombre/teléfono y confirmación), garantizando su usabilidad para adultos mayores o personas con baja alfabetización digital.</w:t>
+                </w:r>
+              </w:p>
+            </w:tc>
+          </w:tr>
+          <w:tr>
+            <w:trPr>
+              <w:cantSplit w:val="0"/>
+              <w:tblHeader w:val="0"/>
+            </w:trPr>
+            <w:tc>
+              <w:tcPr>
+                <w:shd w:fill="auto" w:val="clear"/>
+                <w:tcMar>
+                  <w:top w:w="100.0" w:type="dxa"/>
+                  <w:left w:w="100.0" w:type="dxa"/>
+                  <w:bottom w:w="100.0" w:type="dxa"/>
+                  <w:right w:w="100.0" w:type="dxa"/>
+                </w:tcMar>
+                <w:vAlign w:val="top"/>
+              </w:tcPr>
+              <w:p>
+                <w:pPr>
+                  <w:widowControl w:val="0"/>
+                  <w:spacing w:after="0" w:line="240" w:lineRule="auto"/>
+                  <w:ind w:firstLine="0"/>
                   <w:jc w:val="left"/>
                   <w:rPr>
                     <w:b w:val="1"/>
@@ -8761,28 +8447,17 @@
               </w:tcPr>
               <w:p>
                 <w:pPr>
-                  <w:keepNext w:val="0"/>
-                  <w:keepLines w:val="0"/>
-                  <w:pageBreakBefore w:val="0"/>
-                  <w:widowControl w:val="0"/>
-                  <w:pBdr>
-                    <w:top w:space="0" w:sz="0" w:val="nil"/>
-                    <w:left w:space="0" w:sz="0" w:val="nil"/>
-                    <w:bottom w:space="0" w:sz="0" w:val="nil"/>
-                    <w:right w:space="0" w:sz="0" w:val="nil"/>
-                    <w:between w:space="0" w:sz="0" w:val="nil"/>
-                  </w:pBdr>
-                  <w:shd w:fill="auto" w:val="clear"/>
-                  <w:spacing w:after="0" w:before="0" w:line="240" w:lineRule="auto"/>
-                  <w:ind w:left="0" w:right="0" w:firstLine="0"/>
-                  <w:jc w:val="left"/>
-                  <w:rPr/>
-                </w:pPr>
-                <w:r>
-                  <w:rPr>
-                    <w:rtl w:val="0"/>
-                  </w:rPr>
-                  <w:t xml:space="preserve">Media</w:t>
+                  <w:widowControl w:val="0"/>
+                  <w:spacing w:after="0" w:line="240" w:lineRule="auto"/>
+                  <w:ind w:firstLine="0"/>
+                  <w:jc w:val="left"/>
+                  <w:rPr/>
+                </w:pPr>
+                <w:r>
+                  <w:rPr>
+                    <w:rtl w:val="0"/>
+                  </w:rPr>
+                  <w:t xml:space="preserve">Alta</w:t>
                 </w:r>
               </w:p>
             </w:tc>
@@ -8823,7 +8498,7 @@
     <w:sdt>
       <w:sdtPr>
         <w:lock w:val="contentLocked"/>
-        <w:id w:val="2031649281"/>
+        <w:id w:val="-2027149719"/>
         <w:tag w:val="goog_rdk_12"/>
       </w:sdtPr>
       <w:sdtContent>
@@ -8913,7 +8588,7 @@
                   <w:rPr>
                     <w:rtl w:val="0"/>
                   </w:rPr>
-                  <w:t xml:space="preserve">RNF02</w:t>
+                  <w:t xml:space="preserve">RNF03</w:t>
                 </w:r>
               </w:p>
             </w:tc>
@@ -8978,7 +8653,7 @@
                   <w:rPr>
                     <w:rtl w:val="0"/>
                   </w:rPr>
-                  <w:t xml:space="preserve">Interfaz simple y accesible</w:t>
+                  <w:t xml:space="preserve">Confidencialidad de los datos del paciente</w:t>
                 </w:r>
               </w:p>
             </w:tc>
@@ -9043,7 +8718,7 @@
                   <w:rPr>
                     <w:rtl w:val="0"/>
                   </w:rPr>
-                  <w:t xml:space="preserve">La interfaz dirigida a los pacientes debe permitir completar el proceso de agendamiento en un máximo de 3 pasos (selección de horario, ingreso de nombre/teléfono y confirmación), garantizando su usabilidad para adultos mayores o personas con baja alfabetización digital.</w:t>
+                  <w:t xml:space="preserve">Los datos personales de los pacientes (teléfono, dirección, historia clínica) deben mantenerse confidenciales, con acceso restringido a la doctora, especialistas y auxiliar</w:t>
                 </w:r>
               </w:p>
             </w:tc>
@@ -9149,7 +8824,7 @@
     <w:sdt>
       <w:sdtPr>
         <w:lock w:val="contentLocked"/>
-        <w:id w:val="-2127632493"/>
+        <w:id w:val="-368458174"/>
         <w:tag w:val="goog_rdk_13"/>
       </w:sdtPr>
       <w:sdtContent>
@@ -9239,7 +8914,7 @@
                   <w:rPr>
                     <w:rtl w:val="0"/>
                   </w:rPr>
-                  <w:t xml:space="preserve">RNF03</w:t>
+                  <w:t xml:space="preserve">RNF04</w:t>
                 </w:r>
               </w:p>
             </w:tc>
@@ -9304,7 +8979,7 @@
                   <w:rPr>
                     <w:rtl w:val="0"/>
                   </w:rPr>
-                  <w:t xml:space="preserve">Confidencialidad de los datos del paciente</w:t>
+                  <w:t xml:space="preserve">Soporte al volumen real de atención</w:t>
                 </w:r>
               </w:p>
             </w:tc>
@@ -9369,7 +9044,7 @@
                   <w:rPr>
                     <w:rtl w:val="0"/>
                   </w:rPr>
-                  <w:t xml:space="preserve">Los datos personales de los pacientes (teléfono, dirección, historia clínica) deben mantenerse confidenciales, con acceso restringido a la doctora, especialistas y auxiliar</w:t>
+                  <w:t xml:space="preserve">El sistema debe manejar la carga transaccional de la clínica (hasta 15 atenciones diarias) manteniendo un tiempo de respuesta de la interfaz inferior a 2 segundos por cada interacción o recarga de agenda.</w:t>
                 </w:r>
               </w:p>
             </w:tc>
@@ -9434,7 +9109,7 @@
                   <w:rPr>
                     <w:rtl w:val="0"/>
                   </w:rPr>
-                  <w:t xml:space="preserve">Alta</w:t>
+                  <w:t xml:space="preserve">Media</w:t>
                 </w:r>
               </w:p>
             </w:tc>
@@ -9475,339 +9150,13 @@
     <w:sdt>
       <w:sdtPr>
         <w:lock w:val="contentLocked"/>
-        <w:id w:val="457865876"/>
+        <w:id w:val="585035955"/>
         <w:tag w:val="goog_rdk_14"/>
       </w:sdtPr>
       <w:sdtContent>
         <w:tbl>
           <w:tblPr>
             <w:tblStyle w:val="Table15"/>
-            <w:tblW w:w="9360.0" w:type="dxa"/>
-            <w:jc w:val="left"/>
-            <w:tblBorders>
-              <w:top w:color="000000" w:space="0" w:sz="8" w:val="single"/>
-              <w:left w:color="000000" w:space="0" w:sz="8" w:val="single"/>
-              <w:bottom w:color="000000" w:space="0" w:sz="8" w:val="single"/>
-              <w:right w:color="000000" w:space="0" w:sz="8" w:val="single"/>
-              <w:insideH w:color="000000" w:space="0" w:sz="8" w:val="single"/>
-              <w:insideV w:color="000000" w:space="0" w:sz="8" w:val="single"/>
-            </w:tblBorders>
-            <w:tblLayout w:type="fixed"/>
-            <w:tblLook w:val="0600"/>
-          </w:tblPr>
-          <w:tblGrid>
-            <w:gridCol w:w="4680"/>
-            <w:gridCol w:w="4680"/>
-            <w:tblGridChange w:id="0">
-              <w:tblGrid>
-                <w:gridCol w:w="4680"/>
-                <w:gridCol w:w="4680"/>
-              </w:tblGrid>
-            </w:tblGridChange>
-          </w:tblGrid>
-          <w:tr>
-            <w:trPr>
-              <w:cantSplit w:val="0"/>
-              <w:tblHeader w:val="0"/>
-            </w:trPr>
-            <w:tc>
-              <w:tcPr>
-                <w:shd w:fill="auto" w:val="clear"/>
-                <w:tcMar>
-                  <w:top w:w="100.0" w:type="dxa"/>
-                  <w:left w:w="100.0" w:type="dxa"/>
-                  <w:bottom w:w="100.0" w:type="dxa"/>
-                  <w:right w:w="100.0" w:type="dxa"/>
-                </w:tcMar>
-                <w:vAlign w:val="top"/>
-              </w:tcPr>
-              <w:p>
-                <w:pPr>
-                  <w:widowControl w:val="0"/>
-                  <w:spacing w:after="0" w:line="240" w:lineRule="auto"/>
-                  <w:ind w:firstLine="0"/>
-                  <w:jc w:val="left"/>
-                  <w:rPr>
-                    <w:b w:val="1"/>
-                    <w:bCs w:val="1"/>
-                  </w:rPr>
-                </w:pPr>
-                <w:r>
-                  <w:rPr>
-                    <w:b w:val="1"/>
-                    <w:bCs w:val="1"/>
-                    <w:rtl w:val="0"/>
-                  </w:rPr>
-                  <w:t xml:space="preserve">Código del Requisito</w:t>
-                </w:r>
-              </w:p>
-            </w:tc>
-            <w:tc>
-              <w:tcPr>
-                <w:shd w:fill="auto" w:val="clear"/>
-                <w:tcMar>
-                  <w:top w:w="100.0" w:type="dxa"/>
-                  <w:left w:w="100.0" w:type="dxa"/>
-                  <w:bottom w:w="100.0" w:type="dxa"/>
-                  <w:right w:w="100.0" w:type="dxa"/>
-                </w:tcMar>
-                <w:vAlign w:val="top"/>
-              </w:tcPr>
-              <w:p>
-                <w:pPr>
-                  <w:widowControl w:val="0"/>
-                  <w:spacing w:after="0" w:line="240" w:lineRule="auto"/>
-                  <w:ind w:firstLine="0"/>
-                  <w:jc w:val="left"/>
-                  <w:rPr/>
-                </w:pPr>
-                <w:r>
-                  <w:rPr>
-                    <w:rtl w:val="0"/>
-                  </w:rPr>
-                  <w:t xml:space="preserve">RNF04</w:t>
-                </w:r>
-              </w:p>
-            </w:tc>
-          </w:tr>
-          <w:tr>
-            <w:trPr>
-              <w:cantSplit w:val="0"/>
-              <w:tblHeader w:val="0"/>
-            </w:trPr>
-            <w:tc>
-              <w:tcPr>
-                <w:shd w:fill="auto" w:val="clear"/>
-                <w:tcMar>
-                  <w:top w:w="100.0" w:type="dxa"/>
-                  <w:left w:w="100.0" w:type="dxa"/>
-                  <w:bottom w:w="100.0" w:type="dxa"/>
-                  <w:right w:w="100.0" w:type="dxa"/>
-                </w:tcMar>
-                <w:vAlign w:val="top"/>
-              </w:tcPr>
-              <w:p>
-                <w:pPr>
-                  <w:widowControl w:val="0"/>
-                  <w:spacing w:after="0" w:line="240" w:lineRule="auto"/>
-                  <w:ind w:firstLine="0"/>
-                  <w:jc w:val="left"/>
-                  <w:rPr>
-                    <w:b w:val="1"/>
-                    <w:bCs w:val="1"/>
-                  </w:rPr>
-                </w:pPr>
-                <w:r>
-                  <w:rPr>
-                    <w:b w:val="1"/>
-                    <w:bCs w:val="1"/>
-                    <w:rtl w:val="0"/>
-                  </w:rPr>
-                  <w:t xml:space="preserve">Nombre</w:t>
-                </w:r>
-              </w:p>
-            </w:tc>
-            <w:tc>
-              <w:tcPr>
-                <w:shd w:fill="auto" w:val="clear"/>
-                <w:tcMar>
-                  <w:top w:w="100.0" w:type="dxa"/>
-                  <w:left w:w="100.0" w:type="dxa"/>
-                  <w:bottom w:w="100.0" w:type="dxa"/>
-                  <w:right w:w="100.0" w:type="dxa"/>
-                </w:tcMar>
-                <w:vAlign w:val="top"/>
-              </w:tcPr>
-              <w:p>
-                <w:pPr>
-                  <w:widowControl w:val="0"/>
-                  <w:spacing w:after="0" w:line="240" w:lineRule="auto"/>
-                  <w:ind w:firstLine="0"/>
-                  <w:jc w:val="left"/>
-                  <w:rPr/>
-                </w:pPr>
-                <w:r>
-                  <w:rPr>
-                    <w:rtl w:val="0"/>
-                  </w:rPr>
-                  <w:t xml:space="preserve">Soporte al volumen real de atención</w:t>
-                </w:r>
-              </w:p>
-            </w:tc>
-          </w:tr>
-          <w:tr>
-            <w:trPr>
-              <w:cantSplit w:val="0"/>
-              <w:tblHeader w:val="0"/>
-            </w:trPr>
-            <w:tc>
-              <w:tcPr>
-                <w:shd w:fill="auto" w:val="clear"/>
-                <w:tcMar>
-                  <w:top w:w="100.0" w:type="dxa"/>
-                  <w:left w:w="100.0" w:type="dxa"/>
-                  <w:bottom w:w="100.0" w:type="dxa"/>
-                  <w:right w:w="100.0" w:type="dxa"/>
-                </w:tcMar>
-                <w:vAlign w:val="top"/>
-              </w:tcPr>
-              <w:p>
-                <w:pPr>
-                  <w:widowControl w:val="0"/>
-                  <w:spacing w:after="0" w:line="240" w:lineRule="auto"/>
-                  <w:ind w:firstLine="0"/>
-                  <w:jc w:val="left"/>
-                  <w:rPr>
-                    <w:b w:val="1"/>
-                    <w:bCs w:val="1"/>
-                  </w:rPr>
-                </w:pPr>
-                <w:r>
-                  <w:rPr>
-                    <w:b w:val="1"/>
-                    <w:bCs w:val="1"/>
-                    <w:rtl w:val="0"/>
-                  </w:rPr>
-                  <w:t xml:space="preserve">Descripción</w:t>
-                </w:r>
-              </w:p>
-            </w:tc>
-            <w:tc>
-              <w:tcPr>
-                <w:shd w:fill="auto" w:val="clear"/>
-                <w:tcMar>
-                  <w:top w:w="100.0" w:type="dxa"/>
-                  <w:left w:w="100.0" w:type="dxa"/>
-                  <w:bottom w:w="100.0" w:type="dxa"/>
-                  <w:right w:w="100.0" w:type="dxa"/>
-                </w:tcMar>
-                <w:vAlign w:val="top"/>
-              </w:tcPr>
-              <w:p>
-                <w:pPr>
-                  <w:widowControl w:val="0"/>
-                  <w:spacing w:after="0" w:line="240" w:lineRule="auto"/>
-                  <w:ind w:firstLine="0"/>
-                  <w:jc w:val="left"/>
-                  <w:rPr/>
-                </w:pPr>
-                <w:r>
-                  <w:rPr>
-                    <w:rtl w:val="0"/>
-                  </w:rPr>
-                  <w:t xml:space="preserve">El sistema debe manejar la carga transaccional de la clínica (hasta 15 atenciones diarias) manteniendo un tiempo de respuesta de la interfaz inferior a 2 segundos por cada interacción o recarga de agenda.</w:t>
-                </w:r>
-              </w:p>
-            </w:tc>
-          </w:tr>
-          <w:tr>
-            <w:trPr>
-              <w:cantSplit w:val="0"/>
-              <w:tblHeader w:val="0"/>
-            </w:trPr>
-            <w:tc>
-              <w:tcPr>
-                <w:shd w:fill="auto" w:val="clear"/>
-                <w:tcMar>
-                  <w:top w:w="100.0" w:type="dxa"/>
-                  <w:left w:w="100.0" w:type="dxa"/>
-                  <w:bottom w:w="100.0" w:type="dxa"/>
-                  <w:right w:w="100.0" w:type="dxa"/>
-                </w:tcMar>
-                <w:vAlign w:val="top"/>
-              </w:tcPr>
-              <w:p>
-                <w:pPr>
-                  <w:widowControl w:val="0"/>
-                  <w:spacing w:after="0" w:line="240" w:lineRule="auto"/>
-                  <w:ind w:firstLine="0"/>
-                  <w:jc w:val="left"/>
-                  <w:rPr>
-                    <w:b w:val="1"/>
-                    <w:bCs w:val="1"/>
-                  </w:rPr>
-                </w:pPr>
-                <w:r>
-                  <w:rPr>
-                    <w:b w:val="1"/>
-                    <w:bCs w:val="1"/>
-                    <w:rtl w:val="0"/>
-                  </w:rPr>
-                  <w:t xml:space="preserve">Prioridad</w:t>
-                </w:r>
-              </w:p>
-            </w:tc>
-            <w:tc>
-              <w:tcPr>
-                <w:shd w:fill="auto" w:val="clear"/>
-                <w:tcMar>
-                  <w:top w:w="100.0" w:type="dxa"/>
-                  <w:left w:w="100.0" w:type="dxa"/>
-                  <w:bottom w:w="100.0" w:type="dxa"/>
-                  <w:right w:w="100.0" w:type="dxa"/>
-                </w:tcMar>
-                <w:vAlign w:val="top"/>
-              </w:tcPr>
-              <w:p>
-                <w:pPr>
-                  <w:widowControl w:val="0"/>
-                  <w:spacing w:after="0" w:line="240" w:lineRule="auto"/>
-                  <w:ind w:firstLine="0"/>
-                  <w:jc w:val="left"/>
-                  <w:rPr/>
-                </w:pPr>
-                <w:r>
-                  <w:rPr>
-                    <w:rtl w:val="0"/>
-                  </w:rPr>
-                  <w:t xml:space="preserve">Media</w:t>
-                </w:r>
-              </w:p>
-            </w:tc>
-          </w:tr>
-        </w:tbl>
-      </w:sdtContent>
-    </w:sdt>
-    <w:p>
-      <w:pPr>
-        <w:ind w:firstLine="708.6614173228347"/>
-        <w:jc w:val="left"/>
-        <w:rPr>
-          <w:b w:val="1"/>
-          <w:bCs w:val="1"/>
-        </w:rPr>
-      </w:pPr>
-      <w:r>
-        <w:rPr>
-          <w:rtl w:val="0"/>
-        </w:rPr>
-      </w:r>
-    </w:p>
-    <w:p>
-      <w:pPr>
-        <w:ind w:firstLine="708.6614173228347"/>
-        <w:jc w:val="left"/>
-        <w:rPr>
-          <w:b w:val="1"/>
-          <w:bCs w:val="1"/>
-        </w:rPr>
-      </w:pPr>
-      <w:r>
-        <w:rPr>
-          <w:rtl w:val="0"/>
-        </w:rPr>
-      </w:r>
-    </w:p>
-    <w:sdt>
-      <w:sdtPr>
-        <w:lock w:val="contentLocked"/>
-        <w:id w:val="1363686484"/>
-        <w:tag w:val="goog_rdk_15"/>
-      </w:sdtPr>
-      <w:sdtContent>
-        <w:tbl>
-          <w:tblPr>
-            <w:tblStyle w:val="Table16"/>
             <w:tblW w:w="9360.0" w:type="dxa"/>
             <w:jc w:val="left"/>
             <w:tblBorders>
@@ -10899,13 +10248,6 @@
       <w:tblStyleColBandSize w:val="1"/>
     </w:tblPr>
   </w:style>
-  <w:style w:type="table" w:styleId="Table16">
-    <w:basedOn w:val="TableNormal"/>
-    <w:tblPr>
-      <w:tblStyleRowBandSize w:val="1"/>
-      <w:tblStyleColBandSize w:val="1"/>
-    </w:tblPr>
-  </w:style>
 </w:styles>
 </file>
 
@@ -11231,7 +10573,7 @@
 
 <file path=customXML/item1.xml><?xml version="1.0" encoding="utf-8"?>
 <go:gDocsCustomXmlDataStorage xmlns:go="http://customooxmlschemas.google.com/" xmlns:r="http://schemas.openxmlformats.org/officeDocument/2006/relationships" uri="GoogleDocsCustomDataVersion2">
-  <go:docsCustomData xmlns:go="http://customooxmlschemas.google.com/" roundtripDataSignature="AMtx7miub9Hd3wp4JeLAp3ExL0FpxyuHxQ==">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</go:docsCustomData>
+  <go:docsCustomData xmlns:go="http://customooxmlschemas.google.com/" roundtripDataSignature="AMtx7mgxbESybJio6BXMU85BOLwY+7aeEQ==">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</go:docsCustomData>
 </go:gDocsCustomXmlDataStorage>
 </file>
 

</xml_diff>